<commit_message>
Apply bounded journal review edits and preserve frozen source metadata
</commit_message>
<xml_diff>
--- a/research/manuscripts/surface-targets/emc-tissue-rna-prioritization-manuscript.docx
+++ b/research/manuscripts/surface-targets/emc-tissue-rna-prioritization-manuscript.docx
@@ -149,7 +149,7 @@
         <w:rPr>
           <w:sz w:val="21"/>
         </w:rPr>
-        <w:t xml:space="preserve"> CSPG4 alone met the panel rule: marginal A=0.895 and matched A=0.811. Its LGFMS-specific A was 1.000 in arrays and 0.966 marginal/0.933 matched in RNA sequencing. Single-patient and single-histology deletions retained positive composite directions. Removing 2019, however, reversed the matched composite to 0.433. The marginal DFSP context comparison was also nonpositive (A=0.467). CHRNA6 had A=1 in all primary comparisons. Other candidates showed weak, reversed or comparator-dependent effects.</w:t>
+        <w:t xml:space="preserve"> CSPG4 alone met the panel rule: marginal A=0.895 and matched A=0.811. Its LGFMS-specific A was 1.000 in arrays and 0.966 marginal/0.933 matched in RNA sequencing. Single-patient and single-histology deletions retained positive composite directions. Removing 2019, however, reversed the matched composite to 0.433. The marginal dermatofibrosarcoma protuberans (DFSP) context comparison was also nonpositive (A=0.467). CHRNA6 had A=1 in all primary comparisons. Other candidates showed weak, reversed or comparator-dependent effects.</w:t>
       </w:r>
     </w:p>
     <w:p>
@@ -423,7 +423,7 @@
     </w:p>
     <w:p>
       <w:r>
-        <w:t>Several limitations remain. The source cohort was a convenience sample, and sequencing year is an incomplete proxy for library chemistry, RNA quality and processing batch. Restricting to supported years substantially reduces the EMC sample. The array biopsy lesion stage is unknown, and exclusion of explicit old cases cannot prove absence of every historical overlap. Bulk tissue admixture can produce differences unrelated to malignant-cell expression; EMC purity and grade were unavailable for adjustment. TPM and RMA signals have different measurement properties despite a common rank estimand. Normal tissues were not matched to tumors, HPA includes incomplete or uncertain protein evidence, and the two muscle pools cannot establish organ safety. Finally, the prioritization threshold is an allocation rule rather than a clinically validated effect size or a statistical discovery procedure.</w:t>
+        <w:t>Several limitations remain. The source cohort was a convenience sample, and sequencing year is an incomplete proxy for library chemistry, RNA quality and processing batch. Restricting to supported years substantially reduces the EMC sample. The array biopsy lesion stage is unknown, and exclusion of explicit old cases cannot prove absence of every historical overlap. Bulk tissue admixture can produce differences unrelated to malignant-cell expression; EMC purity and grade were unavailable for adjustment. TPM and RMA signals have different measurement properties despite a common rank estimand. Normal tissues were not matched to tumors, HPA includes incomplete or uncertain protein evidence, and the two muscle pools cannot establish organ safety. Sex- and gender-specific effects were not assessed; these small cohorts do not establish generalizability across sex or gender groups. Finally, the prioritization threshold is an allocation rule rather than a clinically validated effect size or a statistical discovery procedure.</w:t>
       </w:r>
     </w:p>
     <w:p>

</xml_diff>